<commit_message>
Add trimmed video script and updated files
</commit_message>
<xml_diff>
--- a/docs/COIT12204_A4_Report_Tanjim_Ahmed_Mahi.docx
+++ b/docs/COIT12204_A4_Report_Tanjim_Ahmed_Mahi.docx
@@ -89,6 +89,21 @@
       <w:pPr>
         <w:jc w:val="center"/>
       </w:pPr>
+      <w:r>
+        <w:t>Git</w:t>
+      </w:r>
+      <w:r>
+        <w:t xml:space="preserve"> </w:t>
+      </w:r>
+      <w:r>
+        <w:t>repository</w:t>
+      </w:r>
+      <w:r>
+        <w:t xml:space="preserve">: </w:t>
+      </w:r>
+      <w:r>
+        <w:t>https://github.com/tanjimahmedmahi1234/expense-agent-a4</w:t>
+      </w:r>
     </w:p>
     <w:p>
       <w:r>

</xml_diff>